<commit_message>
imatges peça 7a: tres blocs de figura amb peu propi (situació 1-2 i projecte 0-2 a l'1.1, assaigs al 2.2) i numeració per presència
- plantilla: blocs condicionals clonats (script lxml `docs/imatges/scripts/peca7_plantilla.py`), cap taula nova
  (l'extractor aparella taules per ordre: una taula més mou 23-28 claus de veritat per projecte)
- generador: `figure_numbers` (situació → projecte → assaigs → cullera → geològic → tall) refeta a
  `render_template` amb les imatges reals; `num_project_figures` fora
- image_manager: `fig_situacio_image_1/2`, `fig_assaigs_image`, `fig_projecte_image_1/2` + `_caption`,
  noms antics com a àlies; l'A.01 sencer i el retall `main_plan` del rol fora (D4)
- extractor: dos peus poden portar el mateix forat; els forats de numeració acaben en `_num`
- 14 tests nous (`tests/test_peca7_figures.py`), 4 actualitzats

Co-Authored-By: Claude Fable 5.1 <noreply@anthropic.com>
</commit_message>
<xml_diff>
--- a/templates/g3dt-jinja-template.docx
+++ b/templates/g3dt-jinja-template.docx
@@ -3408,6 +3408,11 @@
         </w:rPr>
       </w:pPr>
     </w:p>
+    <w:p>
+      <w:r>
+        <w:t xml:space="preserve">{%p if not fig_situacio_image_2 %}</w:t>
+      </w:r>
+    </w:p>
     <w:tbl>
       <w:tblPr>
         <w:tblW w:type="auto" w:w="0"/>
@@ -3435,7 +3440,7 @@
               <w:jc w:val="center"/>
             </w:pPr>
             <w:r>
-              <w:t>{{ fig_cadastre_image }}</w:t>
+              <w:t xml:space="preserve">{{ fig_situacio_image_1 }}</w:t>
             </w:r>
           </w:p>
         </w:tc>
@@ -3453,7 +3458,17 @@
         <w:rPr>
           <w:sz w:val="16"/>
         </w:rPr>
-        <w:t xml:space="preserve">Figura {{ fig_cadastre_num }}. Situació de la zona d'estudi.</w:t>
+        <w:t xml:space="preserve">Figura {{ fig_situacio_num }}. Situació de la zona d'estudi.</w:t>
+      </w:r>
+    </w:p>
+    <w:p>
+      <w:r>
+        <w:t xml:space="preserve">{%p endif %}</w:t>
+      </w:r>
+    </w:p>
+    <w:p>
+      <w:r>
+        <w:t xml:space="preserve">{%p if fig_situacio_image_2 %}</w:t>
       </w:r>
     </w:p>
     <w:p>
@@ -3466,7 +3481,7 @@
         </w:rPr>
       </w:pPr>
       <w:r>
-        <w:t>{{ fig_main_plan_image }}</w:t>
+        <w:t xml:space="preserve">{{ fig_situacio_image_1 }}  {{ fig_situacio_image_2 }}</w:t>
       </w:r>
     </w:p>
     <w:p>
@@ -3474,15 +3489,97 @@
         <w:jc w:val="center"/>
         <w:rPr>
           <w:rFonts w:eastAsia="Dotum"/>
+          <w:szCs w:val="20"/>
+        </w:rPr>
+      </w:pPr>
+      <w:r>
+        <w:rPr>
+          <w:sz w:val="16"/>
+        </w:rPr>
+        <w:t xml:space="preserve">Figura {{ fig_situacio_num }} i Figura {{ fig_situacio_2_num }}. Detall de la ubicació de la parcel·la en estudi. Font: Projecte.</w:t>
+      </w:r>
+    </w:p>
+    <w:p>
+      <w:r>
+        <w:t xml:space="preserve">{%p endif %}</w:t>
+      </w:r>
+    </w:p>
+    <w:p>
+      <w:r>
+        <w:t xml:space="preserve">{%p if fig_projecte_image_1 %}</w:t>
+      </w:r>
+    </w:p>
+    <w:p>
+      <w:pPr>
+        <w:jc w:val="center"/>
+        <w:rPr>
+          <w:rFonts w:eastAsia="Dotum"/>
           <w:bCs/>
           <w:szCs w:val="20"/>
         </w:rPr>
       </w:pPr>
       <w:r>
+        <w:t xml:space="preserve">{{ fig_projecte_image_1 }}</w:t>
+      </w:r>
+    </w:p>
+    <w:p>
+      <w:pPr>
+        <w:jc w:val="center"/>
+        <w:rPr>
+          <w:rFonts w:eastAsia="Dotum"/>
+          <w:bCs/>
+          <w:szCs w:val="20"/>
+        </w:rPr>
+      </w:pPr>
+      <w:r>
         <w:rPr>
           <w:sz w:val="16"/>
         </w:rPr>
-        <w:t>Figura {{ fig_main_plan_num }}. Ubicació de l'habitatge a l'interior de la parcel·la. Font: Projecte.</w:t>
+        <w:t xml:space="preserve">Figura {{ fig_projecte_1_num }}. {{ fig_projecte_caption_1 }}</w:t>
+      </w:r>
+    </w:p>
+    <w:p>
+      <w:r>
+        <w:t xml:space="preserve">{%p endif %}</w:t>
+      </w:r>
+    </w:p>
+    <w:p>
+      <w:r>
+        <w:t xml:space="preserve">{%p if fig_projecte_image_2 %}</w:t>
+      </w:r>
+    </w:p>
+    <w:p>
+      <w:pPr>
+        <w:jc w:val="center"/>
+        <w:rPr>
+          <w:rFonts w:eastAsia="Dotum"/>
+          <w:bCs/>
+          <w:szCs w:val="20"/>
+        </w:rPr>
+      </w:pPr>
+      <w:r>
+        <w:t xml:space="preserve">{{ fig_projecte_image_2 }}</w:t>
+      </w:r>
+    </w:p>
+    <w:p>
+      <w:pPr>
+        <w:jc w:val="center"/>
+        <w:rPr>
+          <w:rFonts w:eastAsia="Dotum"/>
+          <w:bCs/>
+          <w:szCs w:val="20"/>
+        </w:rPr>
+      </w:pPr>
+      <w:r>
+        <w:rPr>
+          <w:sz w:val="16"/>
+        </w:rPr>
+        <w:t xml:space="preserve">Figura {{ fig_projecte_2_num }}. {{ fig_projecte_caption_2 }}</w:t>
+      </w:r>
+    </w:p>
+    <w:p>
+      <w:r>
+        <w:t xml:space="preserve">{%p endif %}</w:t>
       </w:r>
     </w:p>
     <w:p>
@@ -5226,6 +5323,45 @@
           <w:lang w:val="ca-ES"/>
         </w:rPr>
         <w:t xml:space="preserve"> </w:t>
+      </w:r>
+    </w:p>
+    <w:p>
+      <w:r>
+        <w:t xml:space="preserve">{%p if fig_assaigs_image %}</w:t>
+      </w:r>
+    </w:p>
+    <w:p>
+      <w:pPr>
+        <w:jc w:val="center"/>
+        <w:rPr>
+          <w:rFonts w:eastAsia="Dotum"/>
+          <w:bCs/>
+          <w:szCs w:val="20"/>
+        </w:rPr>
+      </w:pPr>
+      <w:r>
+        <w:t xml:space="preserve">{{ fig_assaigs_image }}</w:t>
+      </w:r>
+    </w:p>
+    <w:p>
+      <w:pPr>
+        <w:jc w:val="center"/>
+        <w:rPr>
+          <w:rFonts w:eastAsia="Dotum"/>
+          <w:bCs/>
+          <w:szCs w:val="20"/>
+        </w:rPr>
+      </w:pPr>
+      <w:r>
+        <w:rPr>
+          <w:sz w:val="16"/>
+        </w:rPr>
+        <w:t xml:space="preserve">Figura {{ fig_assaigs_num }}. Situació de l'estructura projectada i els assaigs realitzats.</w:t>
+      </w:r>
+    </w:p>
+    <w:p>
+      <w:r>
+        <w:t xml:space="preserve">{%p endif %}</w:t>
       </w:r>
     </w:p>
     <w:p>

</xml_diff>